<commit_message>
Player controls (progress bar, back, 1x/2x/3x), who sees private values, role and rule creation, sample data, docs
</commit_message>
<xml_diff>
--- a/docs/Lives_MDM_2page_Summary.docx
+++ b/docs/Lives_MDM_2page_Summary.docx
@@ -32,7 +32,59 @@
           <w:sz w:val="18"/>
           <w:szCs w:val="18"/>
         </w:rPr>
-        <w:t>Demo video: [YouTube link to add]     Code: [GitHub link to add]     Live prototype: [deployment link to add]</w:t>
+        <w:t>Demo video: Code:</w:t>
+      </w:r>
+      <w:r>
+        <w:rPr>
+          <w:color w:val="auto"/>
+          <w:sz w:val="18"/>
+          <w:szCs w:val="18"/>
+        </w:rPr>
+        <w:t xml:space="preserve"> </w:t>
+      </w:r>
+      <w:hyperlink r:id="rId5" w:history="1">
+        <w:r>
+          <w:rPr>
+            <w:rStyle w:val="Hyperlink"/>
+            <w:sz w:val="18"/>
+            <w:szCs w:val="18"/>
+          </w:rPr>
+          <w:t>https://github.com/dairyers/lives-mdm-platform</w:t>
+        </w:r>
+      </w:hyperlink>
+      <w:r>
+        <w:rPr>
+          <w:color w:val="auto"/>
+          <w:sz w:val="18"/>
+          <w:szCs w:val="18"/>
+        </w:rPr>
+        <w:t xml:space="preserve"> </w:t>
+      </w:r>
+      <w:r>
+        <w:rPr>
+          <w:color w:val="auto"/>
+          <w:sz w:val="18"/>
+          <w:szCs w:val="18"/>
+        </w:rPr>
+        <w:t xml:space="preserve">Live prototype: </w:t>
+      </w:r>
+      <w:hyperlink r:id="rId6" w:history="1">
+        <w:r>
+          <w:rPr>
+            <w:rStyle w:val="Hyperlink"/>
+            <w:sz w:val="18"/>
+            <w:szCs w:val="18"/>
+          </w:rPr>
+          <w:t>https://lives-mdm-platform-m8elmfzg9kjup2dqsnuwz7.streamlit.app/</w:t>
+        </w:r>
+      </w:hyperlink>
+      <w:r>
+        <w:rPr>
+          <w:color w:val="auto"/>
+          <w:sz w:val="18"/>
+          <w:szCs w:val="18"/>
+        </w:rPr>
+        <w:t xml:space="preserve"> </w:t>
       </w:r>
     </w:p>
     <w:p>
@@ -439,7 +491,13 @@
         <w:rPr>
           <w:color w:val="auto"/>
         </w:rPr>
-        <w:t>A shared mailbox is free and familiar but is the source of the 18-day wait. Microsoft Forms with Power Automate is quick but has no fuzzy duplicate scoring or field-level visibility</w:t>
+        <w:t xml:space="preserve">A shared mailbox is free and familiar but is the source of the 18-day wait. Microsoft Forms with Power Automate is quick but has no fuzzy duplicate scoring or field-level </w:t>
+      </w:r>
+      <w:r>
+        <w:rPr>
+          <w:color w:val="auto"/>
+        </w:rPr>
+        <w:t>visibility</w:t>
       </w:r>
       <w:r>
         <w:rPr>
@@ -451,7 +509,37 @@
         <w:rPr>
           <w:color w:val="auto"/>
         </w:rPr>
-        <w:t xml:space="preserve"> so we keep it only to deliver emails and Teams alerts. SAP MDG or a commercial MDM suite gives full governance but needs licences and an IT team the brief says we do not have. A thin app with one rules file fixes intake, speed, privacy and forecasting in one place; the price is that someone must host and maintain it, and the SAP and Microsoft 365 connections are not built yet (section 6).</w:t>
+        <w:t>so</w:t>
+      </w:r>
+      <w:r>
+        <w:rPr>
+          <w:color w:val="auto"/>
+        </w:rPr>
+        <w:t xml:space="preserve"> we keep it only to deliver emails and Teams alerts. SAP MDG or a commercial MDM suite gives full governance but needs licences and a</w:t>
+      </w:r>
+      <w:r>
+        <w:rPr>
+          <w:color w:val="auto"/>
+        </w:rPr>
+        <w:t xml:space="preserve"> full fledged </w:t>
+      </w:r>
+      <w:r>
+        <w:rPr>
+          <w:color w:val="auto"/>
+        </w:rPr>
+        <w:t xml:space="preserve">IT team </w:t>
+      </w:r>
+      <w:r>
+        <w:rPr>
+          <w:color w:val="auto"/>
+        </w:rPr>
+        <w:t>that the organisation does</w:t>
+      </w:r>
+      <w:r>
+        <w:rPr>
+          <w:color w:val="auto"/>
+        </w:rPr>
+        <w:t xml:space="preserve"> not have. A thin app with one rules file fixes intake, speed, privacy and forecasting in one place; the price is that someone must host and maintain it, and the SAP and Microsoft 365 connections are not built yet (section 6).</w:t>
       </w:r>
     </w:p>
     <w:p>
@@ -640,20 +728,14 @@
           <w:bCs/>
           <w:color w:val="auto"/>
         </w:rPr>
+        <w:lastRenderedPageBreak/>
         <w:t>How we know it is better.</w:t>
       </w:r>
       <w:r>
         <w:rPr>
           <w:color w:val="auto"/>
         </w:rPr>
-        <w:t xml:space="preserve"> We hid the last 6 months from every model, forecast them, and measured the error as WAPE (total absolute error divided by total actual units; lower is better) across the 15 country and product series. Nothing was </w:t>
-      </w:r>
-      <w:r>
-        <w:rPr>
-          <w:color w:val="auto"/>
-        </w:rPr>
-        <w:lastRenderedPageBreak/>
-        <w:t xml:space="preserve">tuned to win. Own season plus regional growth was off by </w:t>
+        <w:t xml:space="preserve"> We hid the last 6 months from every model, forecast them, and measured the error as WAPE (total absolute error divided by total actual units; lower is better) across the 15 country and product series. Nothing was tuned to win. Own season plus regional growth was off by </w:t>
       </w:r>
       <w:r>
         <w:rPr>
@@ -1303,6 +1385,110 @@
           <w:color w:val="auto"/>
         </w:rPr>
         <w:t xml:space="preserve">new request types check duplicates by name only. </w:t>
+      </w:r>
+    </w:p>
+    <w:p>
+      <w:pPr>
+        <w:keepNext/>
+        <w:pBdr>
+          <w:bottom w:val="single" w:sz="4" w:space="1" w:color="D5DADF"/>
+        </w:pBdr>
+        <w:spacing w:before="110" w:after="50"/>
+        <w:rPr>
+          <w:color w:val="auto"/>
+        </w:rPr>
+      </w:pPr>
+      <w:r>
+        <w:rPr>
+          <w:b/>
+          <w:bCs/>
+          <w:color w:val="auto"/>
+          <w:sz w:val="23"/>
+          <w:szCs w:val="23"/>
+        </w:rPr>
+        <w:t>7</w:t>
+      </w:r>
+      <w:r>
+        <w:rPr>
+          <w:b/>
+          <w:bCs/>
+          <w:color w:val="auto"/>
+          <w:sz w:val="23"/>
+          <w:szCs w:val="23"/>
+        </w:rPr>
+        <w:t xml:space="preserve">. </w:t>
+      </w:r>
+      <w:r>
+        <w:rPr>
+          <w:b/>
+          <w:bCs/>
+          <w:color w:val="auto"/>
+          <w:sz w:val="23"/>
+          <w:szCs w:val="23"/>
+        </w:rPr>
+        <w:t xml:space="preserve">How we made it more intuitive </w:t>
+      </w:r>
+    </w:p>
+    <w:p>
+      <w:pPr>
+        <w:spacing w:after="40" w:line="250" w:lineRule="auto"/>
+        <w:rPr>
+          <w:color w:val="auto"/>
+        </w:rPr>
+      </w:pPr>
+      <w:r>
+        <w:rPr>
+          <w:color w:val="auto"/>
+        </w:rPr>
+        <w:t>With any new application, it is natural that users get overwhelmed with the number of features.</w:t>
+      </w:r>
+      <w:r>
+        <w:rPr>
+          <w:color w:val="auto"/>
+        </w:rPr>
+        <w:t xml:space="preserve"> We have made it more convenient for the users by creating a </w:t>
+      </w:r>
+      <w:r>
+        <w:rPr>
+          <w:color w:val="auto"/>
+        </w:rPr>
+        <w:t>self-help</w:t>
+      </w:r>
+      <w:r>
+        <w:rPr>
+          <w:color w:val="auto"/>
+        </w:rPr>
+        <w:t xml:space="preserve"> button which is populated with FAQs. These questions are all controlled by the IT administrator, who uses a no-code </w:t>
+      </w:r>
+      <w:r>
+        <w:rPr>
+          <w:color w:val="auto"/>
+        </w:rPr>
+        <w:t>form to create and edit the FAQs. At the same time, use</w:t>
+      </w:r>
+      <w:r>
+        <w:rPr>
+          <w:color w:val="auto"/>
+        </w:rPr>
+        <w:t xml:space="preserve"> cases can be found in the user synopsis, which shows the entire workflow from top to bottom, as well as showing the features of individual roles such as </w:t>
+      </w:r>
+      <w:r>
+        <w:rPr>
+          <w:color w:val="auto"/>
+        </w:rPr>
+        <w:t>a Supervisor or Internal Auditor.</w:t>
+      </w:r>
+      <w:r>
+        <w:rPr>
+          <w:color w:val="auto"/>
+        </w:rPr>
+        <w:t xml:space="preserve"> </w:t>
+      </w:r>
+      <w:r>
+        <w:rPr>
+          <w:color w:val="auto"/>
+        </w:rPr>
+        <w:t>By playing the videos, the user can get a sensing of how the workflow should look like which complements the existing FAQs that the organisation administrator can put in place.</w:t>
       </w:r>
     </w:p>
     <w:p>
@@ -2901,6 +3087,18 @@
     <w:semiHidden/>
     <w:unhideWhenUsed/>
   </w:style>
+  <w:style w:type="character" w:styleId="UnresolvedMention">
+    <w:name w:val="Unresolved Mention"/>
+    <w:basedOn w:val="DefaultParagraphFont"/>
+    <w:uiPriority w:val="99"/>
+    <w:semiHidden/>
+    <w:unhideWhenUsed/>
+    <w:rsid w:val="002E79E7"/>
+    <w:rPr>
+      <w:color w:val="605E5C"/>
+      <w:shd w:val="clear" w:color="auto" w:fill="E1DFDD"/>
+    </w:rPr>
+  </w:style>
 </w:styles>
 </file>
 

</xml_diff>